<commit_message>
Scope: three more principles (stable increments, play-testing, interconnection)
Co-Authored-By: Claude Opus 5.5 <noreply@anthropic.com>
</commit_message>
<xml_diff>
--- a/docs/rpg/SCOPE_OVERVIEW.docx
+++ b/docs/rpg/SCOPE_OVERVIEW.docx
@@ -1198,6 +1198,106 @@
           <w:szCs w:val="21"/>
         </w:rPr>
         <w:t xml:space="preserve">.)</w:t>
+      </w:r>
+    </w:p>
+    <w:p>
+      <w:pPr>
+        <w:tabs>
+          <w:tab w:val="left" w:pos="660"/>
+        </w:tabs>
+        <w:spacing w:after="60" w:line="264"/>
+        <w:ind w:left="660" w:hanging="360"/>
+      </w:pPr>
+      <w:r>
+        <w:rPr>
+          <w:sz w:val="21"/>
+          <w:szCs w:val="21"/>
+        </w:rPr>
+        <w:t xml:space="preserve">5.	</w:t>
+      </w:r>
+      <w:r>
+        <w:rPr>
+          <w:b/>
+          <w:bCs/>
+          <w:sz w:val="21"/>
+          <w:szCs w:val="21"/>
+        </w:rPr>
+        <w:t xml:space="preserve">Keep the game playable.</w:t>
+      </w:r>
+      <w:r>
+        <w:rPr>
+          <w:sz w:val="21"/>
+          <w:szCs w:val="21"/>
+        </w:rPr>
+        <w:t xml:space="preserve"> Develop, test and deploy stable increments; never disappear into a months-long rebuild. Every
+stage ends with a working, deployed game.</w:t>
+      </w:r>
+    </w:p>
+    <w:p>
+      <w:pPr>
+        <w:tabs>
+          <w:tab w:val="left" w:pos="660"/>
+        </w:tabs>
+        <w:spacing w:after="60" w:line="264"/>
+        <w:ind w:left="660" w:hanging="360"/>
+      </w:pPr>
+      <w:r>
+        <w:rPr>
+          <w:sz w:val="21"/>
+          <w:szCs w:val="21"/>
+        </w:rPr>
+        <w:t xml:space="preserve">6.	</w:t>
+      </w:r>
+      <w:r>
+        <w:rPr>
+          <w:b/>
+          <w:bCs/>
+          <w:sz w:val="21"/>
+          <w:szCs w:val="21"/>
+        </w:rPr>
+        <w:t xml:space="preserve">Keep testing actual gameplay.</w:t>
+      </w:r>
+      <w:r>
+        <w:rPr>
+          <w:sz w:val="21"/>
+          <w:szCs w:val="21"/>
+        </w:rPr>
+        <w:t xml:space="preserve"> A technically complete feature isn't necessarily an enjoyable one. Long-running playthroughs
+(the climber over 150+ days, browser playthroughs over weeks of game time) are run every stage to expose repetition, shallow
+decisions and broken progression.</w:t>
+      </w:r>
+    </w:p>
+    <w:p>
+      <w:pPr>
+        <w:tabs>
+          <w:tab w:val="left" w:pos="660"/>
+        </w:tabs>
+        <w:spacing w:after="60" w:line="264"/>
+        <w:ind w:left="660" w:hanging="360"/>
+      </w:pPr>
+      <w:r>
+        <w:rPr>
+          <w:sz w:val="21"/>
+          <w:szCs w:val="21"/>
+        </w:rPr>
+        <w:t xml:space="preserve">7.	</w:t>
+      </w:r>
+      <w:r>
+        <w:rPr>
+          <w:b/>
+          <w:bCs/>
+          <w:sz w:val="21"/>
+          <w:szCs w:val="21"/>
+        </w:rPr>
+        <w:t xml:space="preserve">Keep systems interconnected.</w:t>
+      </w:r>
+      <w:r>
+        <w:rPr>
+          <w:sz w:val="21"/>
+          <w:szCs w:val="21"/>
+        </w:rPr>
+        <w:t xml:space="preserve"> Every new mechanic must influence existing characters, relationships, opportunities or
+consequences. A mechanic nothing else reads is not added.</w:t>
       </w:r>
     </w:p>
     <w:p>

</xml_diff>